<commit_message>
cleanup code and add explenation file
</commit_message>
<xml_diff>
--- a/סיכום מילולי על הפתרונות.docx
+++ b/סיכום מילולי על הפתרונות.docx
@@ -5,43 +5,61 @@
     <w:p>
       <w:pPr>
         <w:pStyle w:val="a9"/>
-        <w:rPr>
-          <w:u w:val="single"/>
-        </w:rPr>
-      </w:pPr>
-      <w:r>
-        <w:rPr>
-          <w:u w:val="single"/>
-          <w:rtl/>
-        </w:rPr>
-        <w:t>מנוע חישוב דינמי</w:t>
-      </w:r>
-      <w:r>
-        <w:rPr>
-          <w:u w:val="single"/>
-        </w:rPr>
-        <w:t xml:space="preserve"> (Dynamic Calculation Engine) </w:t>
-      </w:r>
-      <w:r>
-        <w:rPr>
-          <w:u w:val="single"/>
-          <w:rtl/>
-        </w:rPr>
-        <w:t xml:space="preserve">מבוסס </w:t>
-      </w:r>
+      </w:pPr>
       <w:r>
         <w:rPr>
           <w:b/>
           <w:bCs/>
-          <w:u w:val="single"/>
-        </w:rPr>
-        <w:t>.NET 8</w:t>
-      </w:r>
-      <w:r>
-        <w:rPr>
-          <w:u w:val="single"/>
-        </w:rPr>
-        <w:t>.</w:t>
+          <w:rtl/>
+        </w:rPr>
+        <w:t>פתרון 1 – חישוב דינמי ב־</w:t>
+      </w:r>
+      <w:r>
+        <w:rPr>
+          <w:b/>
+          <w:bCs/>
+        </w:rPr>
+        <w:t xml:space="preserve">C# </w:t>
+      </w:r>
+      <w:r>
+        <w:rPr>
+          <w:rFonts w:hint="cs"/>
+          <w:b/>
+          <w:bCs/>
+          <w:rtl/>
+        </w:rPr>
+        <w:t xml:space="preserve"> </w:t>
+      </w:r>
+      <w:r>
+        <w:rPr>
+          <w:b/>
+          <w:bCs/>
+          <w:rtl/>
+        </w:rPr>
+        <w:t>באמצעות</w:t>
+      </w:r>
+      <w:r>
+        <w:rPr>
+          <w:b/>
+          <w:bCs/>
+        </w:rPr>
+        <w:t xml:space="preserve"> </w:t>
+      </w:r>
+      <w:proofErr w:type="spellStart"/>
+      <w:r>
+        <w:rPr>
+          <w:b/>
+          <w:bCs/>
+        </w:rPr>
+        <w:t>NCalc</w:t>
+      </w:r>
+      <w:proofErr w:type="spellEnd"/>
+      <w:r>
+        <w:rPr>
+          <w:b/>
+          <w:bCs/>
+        </w:rPr>
+        <w:t xml:space="preserve"> </w:t>
       </w:r>
     </w:p>
     <w:p>
@@ -49,29 +67,20 @@
         <w:pStyle w:val="a9"/>
         <w:numPr>
           <w:ilvl w:val="0"/>
-          <w:numId w:val="1"/>
+          <w:numId w:val="4"/>
         </w:numPr>
       </w:pPr>
-      <w:proofErr w:type="gramStart"/>
-      <w:r>
-        <w:t xml:space="preserve">  </w:t>
-      </w:r>
-      <w:r>
-        <w:rPr>
-          <w:b/>
-          <w:bCs/>
-          <w:rtl/>
-        </w:rPr>
-        <w:t>ספריות</w:t>
-      </w:r>
-      <w:proofErr w:type="gramEnd"/>
-      <w:r>
-        <w:rPr>
-          <w:b/>
-          <w:bCs/>
-        </w:rPr>
-        <w:t>:</w:t>
-      </w:r>
+      <w:r>
+        <w:rPr>
+          <w:rtl/>
+        </w:rPr>
+        <w:t xml:space="preserve">טעינת הנתונים והנוסחאות בוצעה ממסד הנתונים באמצעות </w:t>
+      </w:r>
+      <w:proofErr w:type="spellStart"/>
+      <w:r>
+        <w:t>SqlDataAdapter</w:t>
+      </w:r>
+      <w:proofErr w:type="spellEnd"/>
       <w:r>
         <w:t xml:space="preserve"> </w:t>
       </w:r>
@@ -79,18 +88,11 @@
         <w:rPr>
           <w:rtl/>
         </w:rPr>
-        <w:t>שימוש ב</w:t>
-      </w:r>
-      <w:r>
-        <w:t>-</w:t>
+        <w:t xml:space="preserve">לתוך </w:t>
       </w:r>
       <w:proofErr w:type="spellStart"/>
       <w:r>
-        <w:rPr>
-          <w:b/>
-          <w:bCs/>
-        </w:rPr>
-        <w:t>NCalc</w:t>
+        <w:t>DataTable</w:t>
       </w:r>
       <w:proofErr w:type="spellEnd"/>
       <w:r>
@@ -98,33 +100,10 @@
       </w:r>
       <w:r>
         <w:rPr>
-          <w:rtl/>
-        </w:rPr>
-        <w:t>לחישוב נוסחאות בזמן ריצה ו</w:t>
-      </w:r>
-      <w:r>
-        <w:t>-</w:t>
-      </w:r>
-      <w:proofErr w:type="spellStart"/>
-      <w:r>
-        <w:rPr>
-          <w:b/>
-          <w:bCs/>
-        </w:rPr>
-        <w:t>Microsoft.Data.SqlClient</w:t>
-      </w:r>
-      <w:proofErr w:type="spellEnd"/>
-      <w:r>
-        <w:t xml:space="preserve"> </w:t>
-      </w:r>
-      <w:r>
-        <w:rPr>
-          <w:rtl/>
-        </w:rPr>
-        <w:t>לעבודה מול</w:t>
-      </w:r>
-      <w:r>
-        <w:t xml:space="preserve"> SQL.</w:t>
+          <w:rFonts w:hint="cs"/>
+          <w:rtl/>
+        </w:rPr>
+        <w:t>.</w:t>
       </w:r>
     </w:p>
     <w:p>
@@ -132,101 +111,38 @@
         <w:pStyle w:val="a9"/>
         <w:numPr>
           <w:ilvl w:val="0"/>
-          <w:numId w:val="1"/>
+          <w:numId w:val="4"/>
         </w:numPr>
       </w:pPr>
-      <w:proofErr w:type="gramStart"/>
-      <w:r>
-        <w:t xml:space="preserve">  </w:t>
-      </w:r>
-      <w:r>
-        <w:rPr>
-          <w:b/>
-          <w:bCs/>
-          <w:rtl/>
-        </w:rPr>
-        <w:t>שיטת</w:t>
-      </w:r>
-      <w:proofErr w:type="gramEnd"/>
-      <w:r>
-        <w:rPr>
-          <w:b/>
-          <w:bCs/>
-          <w:rtl/>
-        </w:rPr>
-        <w:t xml:space="preserve"> עבודה</w:t>
-      </w:r>
-      <w:r>
-        <w:rPr>
-          <w:b/>
-          <w:bCs/>
-        </w:rPr>
-        <w:t>:</w:t>
-      </w:r>
-      <w:r>
+      <w:r>
+        <w:rPr>
+          <w:rtl/>
+        </w:rPr>
+        <w:t xml:space="preserve">ביצעתי פירוש של הנוסחה למחרוזת חישובית והפעלתי עליה חישוב דינמי באמצעות ספריית </w:t>
+      </w:r>
+      <w:proofErr w:type="spellStart"/>
+      <w:r>
+        <w:t>NCalc</w:t>
+      </w:r>
+      <w:proofErr w:type="spellEnd"/>
+      <w:r>
+        <w:t xml:space="preserve">, </w:t>
+      </w:r>
+      <w:r>
+        <w:rPr>
+          <w:rFonts w:hint="cs"/>
+          <w:rtl/>
+        </w:rPr>
         <w:t xml:space="preserve"> </w:t>
       </w:r>
       <w:r>
         <w:rPr>
           <w:rtl/>
         </w:rPr>
-        <w:t>טעינת מיליון רשומות לזיכרון</w:t>
-      </w:r>
-      <w:r>
-        <w:t xml:space="preserve"> (</w:t>
-      </w:r>
-      <w:proofErr w:type="spellStart"/>
-      <w:r>
-        <w:rPr>
-          <w:b/>
-          <w:bCs/>
-        </w:rPr>
-        <w:t>DataTable</w:t>
-      </w:r>
-      <w:proofErr w:type="spellEnd"/>
-      <w:r>
-        <w:t xml:space="preserve">) </w:t>
-      </w:r>
-      <w:r>
-        <w:rPr>
-          <w:rtl/>
-        </w:rPr>
-        <w:t>וביצוע חישובים אופטימליים עם פרמטרים בפחות משנייה</w:t>
-      </w:r>
-      <w:r>
-        <w:t>.</w:t>
-      </w:r>
-    </w:p>
-    <w:p>
-      <w:pPr>
-        <w:pStyle w:val="a9"/>
-        <w:rPr>
-          <w:rtl/>
-        </w:rPr>
-      </w:pPr>
-    </w:p>
-    <w:p>
-      <w:pPr>
-        <w:pStyle w:val="a9"/>
-        <w:rPr>
-          <w:rtl/>
-        </w:rPr>
-      </w:pPr>
-    </w:p>
-    <w:p>
-      <w:pPr>
-        <w:pStyle w:val="a9"/>
-        <w:rPr>
-          <w:b/>
-          <w:bCs/>
-        </w:rPr>
-      </w:pPr>
-      <w:r>
-        <w:rPr>
-          <w:b/>
-          <w:bCs/>
-        </w:rPr>
-        <w:t>Stored Procedure &amp; Dynamic SQL (Database Side Solution)</w:t>
+        <w:t>כולל תמיכה בביטויי תנאי</w:t>
+      </w:r>
+      <w:r>
+        <w:t xml:space="preserve">. </w:t>
       </w:r>
     </w:p>
     <w:p>
@@ -234,61 +150,117 @@
         <w:pStyle w:val="a9"/>
         <w:numPr>
           <w:ilvl w:val="0"/>
-          <w:numId w:val="3"/>
+          <w:numId w:val="4"/>
         </w:numPr>
       </w:pPr>
       <w:r>
+        <w:rPr>
+          <w:rtl/>
+        </w:rPr>
+        <w:t>את התוצאות ריכזתי והעברתי ל־</w:t>
+      </w:r>
+      <w:r>
+        <w:t xml:space="preserve"> </w:t>
+      </w:r>
+      <w:r>
+        <w:t xml:space="preserve">SQL </w:t>
+      </w:r>
+      <w:r>
+        <w:rPr>
+          <w:rtl/>
+        </w:rPr>
+        <w:t xml:space="preserve">באמצעות </w:t>
+      </w:r>
+      <w:r>
+        <w:t xml:space="preserve"> </w:t>
+      </w:r>
+      <w:proofErr w:type="spellStart"/>
+      <w:r>
+        <w:t>SqlBulkCopy</w:t>
+      </w:r>
+      <w:proofErr w:type="spellEnd"/>
+      <w:r>
+        <w:t xml:space="preserve">, </w:t>
+      </w:r>
+      <w:r>
+        <w:rPr>
+          <w:rtl/>
+        </w:rPr>
+        <w:t xml:space="preserve">שמאפשר טעינה מהירה של כמות גדולה של נתונים ישירות לטבלה ללא הכנסת </w:t>
+      </w:r>
+      <w:proofErr w:type="spellStart"/>
+      <w:r>
+        <w:rPr>
+          <w:rtl/>
+        </w:rPr>
+        <w:t>שורה־שורה</w:t>
+      </w:r>
+      <w:proofErr w:type="spellEnd"/>
+      <w:r>
+        <w:t xml:space="preserve">. </w:t>
+      </w:r>
+    </w:p>
+    <w:p>
+      <w:pPr>
+        <w:pStyle w:val="a9"/>
         <w:rPr>
           <w:b/>
           <w:bCs/>
           <w:rtl/>
         </w:rPr>
-        <w:t>שם הפתרון</w:t>
-      </w:r>
+      </w:pPr>
+    </w:p>
+    <w:p>
+      <w:pPr>
+        <w:pStyle w:val="a9"/>
+      </w:pPr>
       <w:r>
         <w:rPr>
           <w:b/>
           <w:bCs/>
-        </w:rPr>
-        <w:t>:</w:t>
-      </w:r>
-      <w:r>
-        <w:t xml:space="preserve"> </w:t>
-      </w:r>
-      <w:r>
-        <w:rPr>
-          <w:rtl/>
-        </w:rPr>
-        <w:t xml:space="preserve">עיבוד נתונים בצד השרת באמצעות </w:t>
+          <w:rtl/>
+        </w:rPr>
+        <w:t>פתרון 2 – חישוב דינמי ב־</w:t>
       </w:r>
       <w:r>
         <w:rPr>
           <w:b/>
           <w:bCs/>
         </w:rPr>
-        <w:t>Stored Procedure</w:t>
-      </w:r>
-      <w:r>
-        <w:t xml:space="preserve"> </w:t>
-      </w:r>
-      <w:r>
-        <w:rPr>
-          <w:rtl/>
-        </w:rPr>
-        <w:t>ו</w:t>
-      </w:r>
-      <w:r>
-        <w:t>-</w:t>
-      </w:r>
-      <w:r>
-        <w:rPr>
+        <w:t xml:space="preserve">Python </w:t>
+      </w:r>
+      <w:r>
+        <w:rPr>
+          <w:rFonts w:hint="cs"/>
           <w:b/>
           <w:bCs/>
-        </w:rPr>
-        <w:t>Dynamic SQL</w:t>
-      </w:r>
-      <w:r>
-        <w:t>.</w:t>
+          <w:rtl/>
+        </w:rPr>
+        <w:t xml:space="preserve"> </w:t>
+      </w:r>
+      <w:r>
+        <w:rPr>
+          <w:b/>
+          <w:bCs/>
+          <w:rtl/>
+        </w:rPr>
+        <w:t>באמצעות</w:t>
+      </w:r>
+      <w:r>
+        <w:rPr>
+          <w:rFonts w:hint="cs"/>
+          <w:b/>
+          <w:bCs/>
+          <w:rtl/>
+        </w:rPr>
+        <w:t xml:space="preserve"> </w:t>
+      </w:r>
+      <w:r>
+        <w:rPr>
+          <w:b/>
+          <w:bCs/>
+        </w:rPr>
+        <w:t xml:space="preserve"> Pandas</w:t>
       </w:r>
     </w:p>
     <w:p>
@@ -296,167 +268,497 @@
         <w:pStyle w:val="a9"/>
         <w:numPr>
           <w:ilvl w:val="0"/>
-          <w:numId w:val="3"/>
+          <w:numId w:val="5"/>
         </w:numPr>
       </w:pPr>
       <w:r>
         <w:rPr>
-          <w:b/>
-          <w:bCs/>
-          <w:rtl/>
-        </w:rPr>
-        <w:t>טכנולוגיות</w:t>
-      </w:r>
-      <w:r>
-        <w:rPr>
-          <w:b/>
-          <w:bCs/>
-        </w:rPr>
-        <w:t>:</w:t>
-      </w:r>
+          <w:rtl/>
+        </w:rPr>
+        <w:t xml:space="preserve">טעינת הנתונים והנוסחאות בוצעה ממסד הנתונים באמצעות </w:t>
+      </w:r>
+      <w:r>
+        <w:t xml:space="preserve">pandas </w:t>
+      </w:r>
+      <w:r>
+        <w:rPr>
+          <w:rtl/>
+        </w:rPr>
+        <w:t>ו־</w:t>
+      </w:r>
+      <w:proofErr w:type="spellStart"/>
+      <w:r>
+        <w:t>SQLAlchemy</w:t>
+      </w:r>
+      <w:proofErr w:type="spellEnd"/>
       <w:r>
         <w:t xml:space="preserve"> </w:t>
       </w:r>
       <w:r>
         <w:rPr>
-          <w:rtl/>
-        </w:rPr>
-        <w:t>שימוש ב</w:t>
-      </w:r>
-      <w:r>
-        <w:t>-</w:t>
-      </w:r>
-      <w:r>
-        <w:rPr>
-          <w:b/>
-          <w:bCs/>
-        </w:rPr>
-        <w:t>T-SQL</w:t>
-      </w:r>
-      <w:r>
-        <w:t xml:space="preserve"> (</w:t>
-      </w:r>
-      <w:r>
-        <w:rPr>
-          <w:rtl/>
-        </w:rPr>
-        <w:t>שפת ה</w:t>
-      </w:r>
-      <w:r>
-        <w:t xml:space="preserve">-SQL </w:t>
-      </w:r>
-      <w:r>
-        <w:rPr>
-          <w:rtl/>
-        </w:rPr>
-        <w:t>של מיקרוסופט</w:t>
-      </w:r>
-      <w:r>
-        <w:t xml:space="preserve">) </w:t>
-      </w:r>
-      <w:r>
-        <w:rPr>
-          <w:rtl/>
-        </w:rPr>
-        <w:t xml:space="preserve">ובפרוצדורת המערכת </w:t>
+          <w:rFonts w:hint="cs"/>
+          <w:rtl/>
+        </w:rPr>
+        <w:t xml:space="preserve"> </w:t>
+      </w:r>
+      <w:r>
+        <w:rPr>
+          <w:rtl/>
+        </w:rPr>
+        <w:t xml:space="preserve">לתוך </w:t>
       </w:r>
       <w:proofErr w:type="spellStart"/>
       <w:r>
-        <w:rPr>
-          <w:b/>
-          <w:bCs/>
-        </w:rPr>
-        <w:t>sp_executesql</w:t>
+        <w:t>DataFrame</w:t>
       </w:r>
       <w:proofErr w:type="spellEnd"/>
-      <w:r>
-        <w:t xml:space="preserve"> </w:t>
-      </w:r>
-      <w:r>
-        <w:rPr>
-          <w:rtl/>
-        </w:rPr>
-        <w:t>להרצת נוסחאות דינמיות</w:t>
-      </w:r>
-      <w:r>
-        <w:t>.</w:t>
-      </w:r>
     </w:p>
     <w:p>
       <w:pPr>
         <w:pStyle w:val="a9"/>
         <w:numPr>
           <w:ilvl w:val="0"/>
-          <w:numId w:val="3"/>
+          <w:numId w:val="5"/>
         </w:numPr>
       </w:pPr>
+      <w:r>
+        <w:rPr>
+          <w:rtl/>
+        </w:rPr>
+        <w:t xml:space="preserve">ביצעתי המרה של הנוסחאות לפורמט </w:t>
+      </w:r>
+      <w:proofErr w:type="spellStart"/>
+      <w:r>
+        <w:rPr>
+          <w:rtl/>
+        </w:rPr>
+        <w:t>פייתון</w:t>
+      </w:r>
+      <w:proofErr w:type="spellEnd"/>
+      <w:r>
+        <w:rPr>
+          <w:rtl/>
+        </w:rPr>
+        <w:t xml:space="preserve"> והפעלתי חישוב </w:t>
+      </w:r>
+      <w:proofErr w:type="spellStart"/>
+      <w:r>
+        <w:rPr>
+          <w:rtl/>
+        </w:rPr>
+        <w:t>וקטורי</w:t>
+      </w:r>
+      <w:proofErr w:type="spellEnd"/>
+      <w:r>
+        <w:rPr>
+          <w:rtl/>
+        </w:rPr>
+        <w:t xml:space="preserve"> על כל הנתונים באמצעות </w:t>
+      </w:r>
+      <w:r>
+        <w:t xml:space="preserve"> </w:t>
+      </w:r>
+      <w:proofErr w:type="spellStart"/>
+      <w:r>
+        <w:t>DataFrame.eval</w:t>
+      </w:r>
+      <w:proofErr w:type="spellEnd"/>
+      <w:r>
+        <w:t xml:space="preserve"> </w:t>
+      </w:r>
+      <w:r>
+        <w:rPr>
+          <w:rtl/>
+        </w:rPr>
+        <w:t>ו־</w:t>
+      </w:r>
+      <w:proofErr w:type="spellStart"/>
+      <w:r>
+        <w:t>np.where</w:t>
+      </w:r>
+      <w:proofErr w:type="spellEnd"/>
+      <w:r>
+        <w:t xml:space="preserve"> </w:t>
+      </w:r>
+    </w:p>
+    <w:p>
+      <w:pPr>
+        <w:pStyle w:val="a9"/>
+        <w:numPr>
+          <w:ilvl w:val="0"/>
+          <w:numId w:val="5"/>
+        </w:numPr>
+      </w:pPr>
+      <w:r>
+        <w:t>“</w:t>
+      </w:r>
+      <w:r>
+        <w:rPr>
+          <w:rtl/>
+        </w:rPr>
+        <w:t>לאחר ניסיון שמירה רגילה ל־</w:t>
+      </w:r>
+      <w:r>
+        <w:t xml:space="preserve"> </w:t>
+      </w:r>
+      <w:r>
+        <w:t xml:space="preserve">SQL </w:t>
+      </w:r>
+      <w:r>
+        <w:rPr>
+          <w:rtl/>
+        </w:rPr>
+        <w:t>באמצעות כתיבה ישירה מהקוד</w:t>
+      </w:r>
+      <w:r>
+        <w:t>,</w:t>
+      </w:r>
+      <w:r>
+        <w:rPr>
+          <w:rFonts w:hint="cs"/>
+          <w:rtl/>
+        </w:rPr>
+        <w:t xml:space="preserve"> </w:t>
+      </w:r>
+      <w:r>
+        <w:rPr>
+          <w:rtl/>
+        </w:rPr>
+        <w:t>בוצעה אופטימיזציה לתהליך באמצעות כתיבה לקובץ</w:t>
+      </w:r>
+      <w:r>
+        <w:t xml:space="preserve"> CSV </w:t>
+      </w:r>
+      <w:r>
+        <w:rPr>
+          <w:rtl/>
+        </w:rPr>
+        <w:t xml:space="preserve">וטעינה באמצעות </w:t>
+      </w:r>
+      <w:r>
+        <w:t xml:space="preserve">BULK </w:t>
+      </w:r>
+      <w:proofErr w:type="gramStart"/>
+      <w:r>
+        <w:t xml:space="preserve">INSERT, </w:t>
+      </w:r>
+      <w:r>
+        <w:rPr>
+          <w:rFonts w:hint="cs"/>
+          <w:rtl/>
+        </w:rPr>
+        <w:t xml:space="preserve"> </w:t>
+      </w:r>
+      <w:r>
+        <w:rPr>
+          <w:rtl/>
+        </w:rPr>
+        <w:t>מה</w:t>
+      </w:r>
+      <w:proofErr w:type="gramEnd"/>
+      <w:r>
+        <w:rPr>
+          <w:rtl/>
+        </w:rPr>
+        <w:t xml:space="preserve"> שקיצר משמעותית את זמן הריצה על כמויות גדולות של נתונים</w:t>
+      </w:r>
+      <w:r>
+        <w:t>.</w:t>
+      </w:r>
+    </w:p>
+    <w:p>
+      <w:pPr>
+        <w:pStyle w:val="a9"/>
+      </w:pPr>
+      <w:r>
+        <w:rPr>
+          <w:rtl/>
+        </w:rPr>
+        <w:br/>
+      </w:r>
       <w:r>
         <w:rPr>
           <w:b/>
           <w:bCs/>
           <w:rtl/>
         </w:rPr>
-        <w:t>שיטת עבודה</w:t>
+        <w:t>פתרון 3 – חישוב דינמי באמצעות</w:t>
       </w:r>
       <w:r>
         <w:rPr>
           <w:b/>
           <w:bCs/>
         </w:rPr>
-        <w:t>:</w:t>
-      </w:r>
-      <w:r>
-        <w:t xml:space="preserve"> </w:t>
-      </w:r>
-      <w:r>
-        <w:rPr>
-          <w:rtl/>
-        </w:rPr>
-        <w:t>יצירת שאילתות "על המקום" מתוך טבלת הנוסחאות והרצתן ישירות על טבלת הנתונים</w:t>
-      </w:r>
-      <w:r>
-        <w:t xml:space="preserve"> (</w:t>
-      </w:r>
-      <w:proofErr w:type="spellStart"/>
-      <w:r>
-        <w:t>t_data</w:t>
-      </w:r>
-      <w:proofErr w:type="spellEnd"/>
-      <w:r>
-        <w:t xml:space="preserve">). </w:t>
-      </w:r>
-      <w:r>
-        <w:rPr>
-          <w:rtl/>
-        </w:rPr>
-        <w:t>הפתרון חוסך שינוע של מיליוני שורות ברשת ומנצל את מנוע ה</w:t>
-      </w:r>
-      <w:r>
-        <w:t xml:space="preserve">-Indexing </w:t>
-      </w:r>
-      <w:r>
-        <w:rPr>
-          <w:rtl/>
-        </w:rPr>
-        <w:t>והאופטימיזציה המובנה של</w:t>
-      </w:r>
-      <w:r>
-        <w:t xml:space="preserve"> SQL Server </w:t>
-      </w:r>
-      <w:r>
-        <w:rPr>
-          <w:rtl/>
-        </w:rPr>
-        <w:t>לביצועים מרביים</w:t>
-      </w:r>
-      <w:r>
-        <w:t>.</w:t>
+        <w:t xml:space="preserve"> Stored Procedure </w:t>
+      </w:r>
+      <w:r>
+        <w:rPr>
+          <w:b/>
+          <w:bCs/>
+          <w:rtl/>
+        </w:rPr>
+        <w:t>ב־</w:t>
+      </w:r>
+      <w:r>
+        <w:rPr>
+          <w:b/>
+          <w:bCs/>
+        </w:rPr>
+        <w:t>SQL Server</w:t>
       </w:r>
     </w:p>
     <w:p>
       <w:pPr>
         <w:pStyle w:val="a9"/>
-      </w:pPr>
+        <w:numPr>
+          <w:ilvl w:val="0"/>
+          <w:numId w:val="6"/>
+        </w:numPr>
+      </w:pPr>
+      <w:r>
+        <w:rPr>
+          <w:rtl/>
+        </w:rPr>
+        <w:t>יצירת פרוצדורה ב־</w:t>
+      </w:r>
+      <w:r>
+        <w:t xml:space="preserve"> </w:t>
+      </w:r>
+      <w:r>
+        <w:t xml:space="preserve">SQL Server </w:t>
+      </w:r>
+      <w:r>
+        <w:rPr>
+          <w:rtl/>
+        </w:rPr>
+        <w:t>שמבצעת את כל תהליך החישוב בצד בסיס הנתונים</w:t>
+      </w:r>
+      <w:r>
+        <w:t xml:space="preserve">. </w:t>
+      </w:r>
+    </w:p>
+    <w:p>
+      <w:pPr>
+        <w:pStyle w:val="a9"/>
+        <w:numPr>
+          <w:ilvl w:val="0"/>
+          <w:numId w:val="6"/>
+        </w:numPr>
+      </w:pPr>
+      <w:r>
+        <w:rPr>
+          <w:rtl/>
+        </w:rPr>
+        <w:t xml:space="preserve">מעבר על הנוסחאות מטבלת </w:t>
+      </w:r>
+      <w:proofErr w:type="spellStart"/>
+      <w:r>
+        <w:t>t_targil</w:t>
+      </w:r>
+      <w:proofErr w:type="spellEnd"/>
+      <w:r>
+        <w:t xml:space="preserve"> </w:t>
+      </w:r>
+      <w:r>
+        <w:rPr>
+          <w:rFonts w:hint="cs"/>
+          <w:rtl/>
+        </w:rPr>
+        <w:t xml:space="preserve"> </w:t>
+      </w:r>
+      <w:r>
+        <w:rPr>
+          <w:rtl/>
+        </w:rPr>
+        <w:t>באמצעות</w:t>
+      </w:r>
+      <w:r>
+        <w:t xml:space="preserve"> Cursor, </w:t>
+      </w:r>
+      <w:r>
+        <w:rPr>
+          <w:rtl/>
+        </w:rPr>
+        <w:t xml:space="preserve">ובניית שאילתות דינמיות בעזרת </w:t>
+      </w:r>
+      <w:r>
+        <w:t xml:space="preserve"> </w:t>
+      </w:r>
+      <w:proofErr w:type="spellStart"/>
+      <w:r>
+        <w:t>sp_executesql</w:t>
+      </w:r>
+      <w:proofErr w:type="spellEnd"/>
+      <w:r>
+        <w:t xml:space="preserve">, </w:t>
+      </w:r>
+      <w:r>
+        <w:rPr>
+          <w:rtl/>
+        </w:rPr>
+        <w:t xml:space="preserve">כולל טיפול בתנאים באמצעות </w:t>
+      </w:r>
+      <w:r>
+        <w:t xml:space="preserve">CASE WHEN. </w:t>
+      </w:r>
+    </w:p>
+    <w:p>
+      <w:pPr>
+        <w:pStyle w:val="a9"/>
+        <w:numPr>
+          <w:ilvl w:val="0"/>
+          <w:numId w:val="6"/>
+        </w:numPr>
+      </w:pPr>
+      <w:r>
+        <w:rPr>
+          <w:rtl/>
+        </w:rPr>
+        <w:t xml:space="preserve">ביצוע החישוב ישירות על טבלת </w:t>
+      </w:r>
+      <w:proofErr w:type="spellStart"/>
+      <w:r>
+        <w:t>t_data</w:t>
+      </w:r>
+      <w:proofErr w:type="spellEnd"/>
+      <w:r>
+        <w:t xml:space="preserve"> </w:t>
+      </w:r>
+      <w:r>
+        <w:rPr>
+          <w:rFonts w:hint="cs"/>
+          <w:rtl/>
+        </w:rPr>
+        <w:t xml:space="preserve"> </w:t>
+      </w:r>
+      <w:r>
+        <w:rPr>
+          <w:rtl/>
+        </w:rPr>
+        <w:t>והכנסת התוצאות ל־</w:t>
+      </w:r>
+      <w:proofErr w:type="spellStart"/>
+      <w:r>
+        <w:t>t_results</w:t>
+      </w:r>
+      <w:proofErr w:type="spellEnd"/>
+      <w:r>
+        <w:t xml:space="preserve">, </w:t>
+      </w:r>
+      <w:r>
+        <w:rPr>
+          <w:rtl/>
+        </w:rPr>
+        <w:t>תוך ניצול עיבוד פנימי של ה־</w:t>
+      </w:r>
+      <w:r>
+        <w:t xml:space="preserve"> </w:t>
+      </w:r>
+      <w:r>
+        <w:t xml:space="preserve">DB </w:t>
+      </w:r>
+      <w:r>
+        <w:rPr>
+          <w:rtl/>
+        </w:rPr>
+        <w:t>לצורך ביצועים גבוהים</w:t>
+      </w:r>
+      <w:r>
+        <w:t>.</w:t>
+      </w:r>
+    </w:p>
+    <w:p>
+      <w:pPr>
+        <w:pStyle w:val="a9"/>
+        <w:rPr>
+          <w:rFonts w:hint="cs"/>
+        </w:rPr>
+      </w:pPr>
+      <w:r>
+        <w:rPr>
+          <w:rtl/>
+        </w:rPr>
+        <w:br/>
+      </w:r>
+      <w:r>
+        <w:rPr>
+          <w:rtl/>
+        </w:rPr>
+        <w:t>לפי התוצאות, פתרון ה־</w:t>
+      </w:r>
+      <w:r>
+        <w:t xml:space="preserve">C# </w:t>
+      </w:r>
+      <w:r>
+        <w:rPr>
+          <w:rtl/>
+        </w:rPr>
+        <w:t>עם</w:t>
+      </w:r>
+      <w:r>
+        <w:t xml:space="preserve"> </w:t>
+      </w:r>
+      <w:proofErr w:type="spellStart"/>
+      <w:r>
+        <w:t>NCalc</w:t>
+      </w:r>
+      <w:proofErr w:type="spellEnd"/>
+      <w:r>
+        <w:t xml:space="preserve"> </w:t>
+      </w:r>
+      <w:r>
+        <w:rPr>
+          <w:rtl/>
+        </w:rPr>
+        <w:t>היה היעיל ביותר הכולל, בזכות איזון טוב בין זמן חישוב לזמן כתיבה ל־</w:t>
+      </w:r>
+      <w:r>
+        <w:t>DB.</w:t>
+      </w:r>
+      <w:r>
+        <w:br/>
+      </w:r>
+      <w:r>
+        <w:rPr>
+          <w:rtl/>
+        </w:rPr>
+        <w:t>לעומת זאת</w:t>
+      </w:r>
+      <w:r>
+        <w:t xml:space="preserve">, Python </w:t>
+      </w:r>
+      <w:r>
+        <w:rPr>
+          <w:rtl/>
+        </w:rPr>
+        <w:t xml:space="preserve">אמנם הצטיין במהירות חישוב, אך נפגע מזמני כתיבה וטעינה, </w:t>
+      </w:r>
+      <w:proofErr w:type="spellStart"/>
+      <w:r>
+        <w:rPr>
+          <w:rtl/>
+        </w:rPr>
+        <w:t>וה</w:t>
+      </w:r>
+      <w:proofErr w:type="spellEnd"/>
+      <w:r>
+        <w:rPr>
+          <w:rtl/>
+        </w:rPr>
+        <w:t>־</w:t>
+      </w:r>
+      <w:r>
+        <w:t xml:space="preserve">Stored Procedure </w:t>
+      </w:r>
+      <w:r>
+        <w:rPr>
+          <w:rtl/>
+        </w:rPr>
+        <w:t>סבלה מזמני חישוב איטיים יחסית למרות כתיבה מהירה למסד הנתונים</w:t>
+      </w:r>
+      <w:r>
+        <w:t>.</w:t>
+      </w:r>
     </w:p>
     <w:sectPr>
       <w:pgSz w:w="11906" w:h="16838"/>
@@ -823,6 +1125,345 @@
       </w:pPr>
     </w:lvl>
   </w:abstractNum>
+  <w:abstractNum w:abstractNumId="3" w15:restartNumberingAfterBreak="0">
+    <w:nsid w:val="4CFC19B1"/>
+    <w:multiLevelType w:val="multilevel"/>
+    <w:tmpl w:val="B1A2348C"/>
+    <w:lvl w:ilvl="0">
+      <w:start w:val="1"/>
+      <w:numFmt w:val="decimal"/>
+      <w:lvlText w:val="%1."/>
+      <w:lvlJc w:val="left"/>
+      <w:pPr>
+        <w:tabs>
+          <w:tab w:val="num" w:pos="720"/>
+        </w:tabs>
+        <w:ind w:left="720" w:hanging="360"/>
+      </w:pPr>
+    </w:lvl>
+    <w:lvl w:ilvl="1" w:tentative="1">
+      <w:start w:val="1"/>
+      <w:numFmt w:val="decimal"/>
+      <w:lvlText w:val="%2."/>
+      <w:lvlJc w:val="left"/>
+      <w:pPr>
+        <w:tabs>
+          <w:tab w:val="num" w:pos="1440"/>
+        </w:tabs>
+        <w:ind w:left="1440" w:hanging="360"/>
+      </w:pPr>
+    </w:lvl>
+    <w:lvl w:ilvl="2" w:tentative="1">
+      <w:start w:val="1"/>
+      <w:numFmt w:val="decimal"/>
+      <w:lvlText w:val="%3."/>
+      <w:lvlJc w:val="left"/>
+      <w:pPr>
+        <w:tabs>
+          <w:tab w:val="num" w:pos="2160"/>
+        </w:tabs>
+        <w:ind w:left="2160" w:hanging="360"/>
+      </w:pPr>
+    </w:lvl>
+    <w:lvl w:ilvl="3" w:tentative="1">
+      <w:start w:val="1"/>
+      <w:numFmt w:val="decimal"/>
+      <w:lvlText w:val="%4."/>
+      <w:lvlJc w:val="left"/>
+      <w:pPr>
+        <w:tabs>
+          <w:tab w:val="num" w:pos="2880"/>
+        </w:tabs>
+        <w:ind w:left="2880" w:hanging="360"/>
+      </w:pPr>
+    </w:lvl>
+    <w:lvl w:ilvl="4" w:tentative="1">
+      <w:start w:val="1"/>
+      <w:numFmt w:val="decimal"/>
+      <w:lvlText w:val="%5."/>
+      <w:lvlJc w:val="left"/>
+      <w:pPr>
+        <w:tabs>
+          <w:tab w:val="num" w:pos="3600"/>
+        </w:tabs>
+        <w:ind w:left="3600" w:hanging="360"/>
+      </w:pPr>
+    </w:lvl>
+    <w:lvl w:ilvl="5" w:tentative="1">
+      <w:start w:val="1"/>
+      <w:numFmt w:val="decimal"/>
+      <w:lvlText w:val="%6."/>
+      <w:lvlJc w:val="left"/>
+      <w:pPr>
+        <w:tabs>
+          <w:tab w:val="num" w:pos="4320"/>
+        </w:tabs>
+        <w:ind w:left="4320" w:hanging="360"/>
+      </w:pPr>
+    </w:lvl>
+    <w:lvl w:ilvl="6" w:tentative="1">
+      <w:start w:val="1"/>
+      <w:numFmt w:val="decimal"/>
+      <w:lvlText w:val="%7."/>
+      <w:lvlJc w:val="left"/>
+      <w:pPr>
+        <w:tabs>
+          <w:tab w:val="num" w:pos="5040"/>
+        </w:tabs>
+        <w:ind w:left="5040" w:hanging="360"/>
+      </w:pPr>
+    </w:lvl>
+    <w:lvl w:ilvl="7" w:tentative="1">
+      <w:start w:val="1"/>
+      <w:numFmt w:val="decimal"/>
+      <w:lvlText w:val="%8."/>
+      <w:lvlJc w:val="left"/>
+      <w:pPr>
+        <w:tabs>
+          <w:tab w:val="num" w:pos="5760"/>
+        </w:tabs>
+        <w:ind w:left="5760" w:hanging="360"/>
+      </w:pPr>
+    </w:lvl>
+    <w:lvl w:ilvl="8" w:tentative="1">
+      <w:start w:val="1"/>
+      <w:numFmt w:val="decimal"/>
+      <w:lvlText w:val="%9."/>
+      <w:lvlJc w:val="left"/>
+      <w:pPr>
+        <w:tabs>
+          <w:tab w:val="num" w:pos="6480"/>
+        </w:tabs>
+        <w:ind w:left="6480" w:hanging="360"/>
+      </w:pPr>
+    </w:lvl>
+  </w:abstractNum>
+  <w:abstractNum w:abstractNumId="4" w15:restartNumberingAfterBreak="0">
+    <w:nsid w:val="62BF079F"/>
+    <w:multiLevelType w:val="multilevel"/>
+    <w:tmpl w:val="0E66ABB4"/>
+    <w:lvl w:ilvl="0">
+      <w:start w:val="1"/>
+      <w:numFmt w:val="decimal"/>
+      <w:lvlText w:val="%1."/>
+      <w:lvlJc w:val="left"/>
+      <w:pPr>
+        <w:tabs>
+          <w:tab w:val="num" w:pos="720"/>
+        </w:tabs>
+        <w:ind w:left="720" w:hanging="360"/>
+      </w:pPr>
+    </w:lvl>
+    <w:lvl w:ilvl="1" w:tentative="1">
+      <w:start w:val="1"/>
+      <w:numFmt w:val="decimal"/>
+      <w:lvlText w:val="%2."/>
+      <w:lvlJc w:val="left"/>
+      <w:pPr>
+        <w:tabs>
+          <w:tab w:val="num" w:pos="1440"/>
+        </w:tabs>
+        <w:ind w:left="1440" w:hanging="360"/>
+      </w:pPr>
+    </w:lvl>
+    <w:lvl w:ilvl="2" w:tentative="1">
+      <w:start w:val="1"/>
+      <w:numFmt w:val="decimal"/>
+      <w:lvlText w:val="%3."/>
+      <w:lvlJc w:val="left"/>
+      <w:pPr>
+        <w:tabs>
+          <w:tab w:val="num" w:pos="2160"/>
+        </w:tabs>
+        <w:ind w:left="2160" w:hanging="360"/>
+      </w:pPr>
+    </w:lvl>
+    <w:lvl w:ilvl="3" w:tentative="1">
+      <w:start w:val="1"/>
+      <w:numFmt w:val="decimal"/>
+      <w:lvlText w:val="%4."/>
+      <w:lvlJc w:val="left"/>
+      <w:pPr>
+        <w:tabs>
+          <w:tab w:val="num" w:pos="2880"/>
+        </w:tabs>
+        <w:ind w:left="2880" w:hanging="360"/>
+      </w:pPr>
+    </w:lvl>
+    <w:lvl w:ilvl="4" w:tentative="1">
+      <w:start w:val="1"/>
+      <w:numFmt w:val="decimal"/>
+      <w:lvlText w:val="%5."/>
+      <w:lvlJc w:val="left"/>
+      <w:pPr>
+        <w:tabs>
+          <w:tab w:val="num" w:pos="3600"/>
+        </w:tabs>
+        <w:ind w:left="3600" w:hanging="360"/>
+      </w:pPr>
+    </w:lvl>
+    <w:lvl w:ilvl="5" w:tentative="1">
+      <w:start w:val="1"/>
+      <w:numFmt w:val="decimal"/>
+      <w:lvlText w:val="%6."/>
+      <w:lvlJc w:val="left"/>
+      <w:pPr>
+        <w:tabs>
+          <w:tab w:val="num" w:pos="4320"/>
+        </w:tabs>
+        <w:ind w:left="4320" w:hanging="360"/>
+      </w:pPr>
+    </w:lvl>
+    <w:lvl w:ilvl="6" w:tentative="1">
+      <w:start w:val="1"/>
+      <w:numFmt w:val="decimal"/>
+      <w:lvlText w:val="%7."/>
+      <w:lvlJc w:val="left"/>
+      <w:pPr>
+        <w:tabs>
+          <w:tab w:val="num" w:pos="5040"/>
+        </w:tabs>
+        <w:ind w:left="5040" w:hanging="360"/>
+      </w:pPr>
+    </w:lvl>
+    <w:lvl w:ilvl="7" w:tentative="1">
+      <w:start w:val="1"/>
+      <w:numFmt w:val="decimal"/>
+      <w:lvlText w:val="%8."/>
+      <w:lvlJc w:val="left"/>
+      <w:pPr>
+        <w:tabs>
+          <w:tab w:val="num" w:pos="5760"/>
+        </w:tabs>
+        <w:ind w:left="5760" w:hanging="360"/>
+      </w:pPr>
+    </w:lvl>
+    <w:lvl w:ilvl="8" w:tentative="1">
+      <w:start w:val="1"/>
+      <w:numFmt w:val="decimal"/>
+      <w:lvlText w:val="%9."/>
+      <w:lvlJc w:val="left"/>
+      <w:pPr>
+        <w:tabs>
+          <w:tab w:val="num" w:pos="6480"/>
+        </w:tabs>
+        <w:ind w:left="6480" w:hanging="360"/>
+      </w:pPr>
+    </w:lvl>
+  </w:abstractNum>
+  <w:abstractNum w:abstractNumId="5" w15:restartNumberingAfterBreak="0">
+    <w:nsid w:val="63893B61"/>
+    <w:multiLevelType w:val="multilevel"/>
+    <w:tmpl w:val="6CB4CC1C"/>
+    <w:lvl w:ilvl="0">
+      <w:start w:val="1"/>
+      <w:numFmt w:val="decimal"/>
+      <w:lvlText w:val="%1."/>
+      <w:lvlJc w:val="left"/>
+      <w:pPr>
+        <w:tabs>
+          <w:tab w:val="num" w:pos="720"/>
+        </w:tabs>
+        <w:ind w:left="720" w:hanging="360"/>
+      </w:pPr>
+    </w:lvl>
+    <w:lvl w:ilvl="1" w:tentative="1">
+      <w:start w:val="1"/>
+      <w:numFmt w:val="decimal"/>
+      <w:lvlText w:val="%2."/>
+      <w:lvlJc w:val="left"/>
+      <w:pPr>
+        <w:tabs>
+          <w:tab w:val="num" w:pos="1440"/>
+        </w:tabs>
+        <w:ind w:left="1440" w:hanging="360"/>
+      </w:pPr>
+    </w:lvl>
+    <w:lvl w:ilvl="2" w:tentative="1">
+      <w:start w:val="1"/>
+      <w:numFmt w:val="decimal"/>
+      <w:lvlText w:val="%3."/>
+      <w:lvlJc w:val="left"/>
+      <w:pPr>
+        <w:tabs>
+          <w:tab w:val="num" w:pos="2160"/>
+        </w:tabs>
+        <w:ind w:left="2160" w:hanging="360"/>
+      </w:pPr>
+    </w:lvl>
+    <w:lvl w:ilvl="3" w:tentative="1">
+      <w:start w:val="1"/>
+      <w:numFmt w:val="decimal"/>
+      <w:lvlText w:val="%4."/>
+      <w:lvlJc w:val="left"/>
+      <w:pPr>
+        <w:tabs>
+          <w:tab w:val="num" w:pos="2880"/>
+        </w:tabs>
+        <w:ind w:left="2880" w:hanging="360"/>
+      </w:pPr>
+    </w:lvl>
+    <w:lvl w:ilvl="4" w:tentative="1">
+      <w:start w:val="1"/>
+      <w:numFmt w:val="decimal"/>
+      <w:lvlText w:val="%5."/>
+      <w:lvlJc w:val="left"/>
+      <w:pPr>
+        <w:tabs>
+          <w:tab w:val="num" w:pos="3600"/>
+        </w:tabs>
+        <w:ind w:left="3600" w:hanging="360"/>
+      </w:pPr>
+    </w:lvl>
+    <w:lvl w:ilvl="5" w:tentative="1">
+      <w:start w:val="1"/>
+      <w:numFmt w:val="decimal"/>
+      <w:lvlText w:val="%6."/>
+      <w:lvlJc w:val="left"/>
+      <w:pPr>
+        <w:tabs>
+          <w:tab w:val="num" w:pos="4320"/>
+        </w:tabs>
+        <w:ind w:left="4320" w:hanging="360"/>
+      </w:pPr>
+    </w:lvl>
+    <w:lvl w:ilvl="6" w:tentative="1">
+      <w:start w:val="1"/>
+      <w:numFmt w:val="decimal"/>
+      <w:lvlText w:val="%7."/>
+      <w:lvlJc w:val="left"/>
+      <w:pPr>
+        <w:tabs>
+          <w:tab w:val="num" w:pos="5040"/>
+        </w:tabs>
+        <w:ind w:left="5040" w:hanging="360"/>
+      </w:pPr>
+    </w:lvl>
+    <w:lvl w:ilvl="7" w:tentative="1">
+      <w:start w:val="1"/>
+      <w:numFmt w:val="decimal"/>
+      <w:lvlText w:val="%8."/>
+      <w:lvlJc w:val="left"/>
+      <w:pPr>
+        <w:tabs>
+          <w:tab w:val="num" w:pos="5760"/>
+        </w:tabs>
+        <w:ind w:left="5760" w:hanging="360"/>
+      </w:pPr>
+    </w:lvl>
+    <w:lvl w:ilvl="8" w:tentative="1">
+      <w:start w:val="1"/>
+      <w:numFmt w:val="decimal"/>
+      <w:lvlText w:val="%9."/>
+      <w:lvlJc w:val="left"/>
+      <w:pPr>
+        <w:tabs>
+          <w:tab w:val="num" w:pos="6480"/>
+        </w:tabs>
+        <w:ind w:left="6480" w:hanging="360"/>
+      </w:pPr>
+    </w:lvl>
+  </w:abstractNum>
   <w:num w:numId="1" w16cid:durableId="2073963612">
     <w:abstractNumId w:val="0"/>
   </w:num>
@@ -831,6 +1472,15 @@
   </w:num>
   <w:num w:numId="3" w16cid:durableId="2111047458">
     <w:abstractNumId w:val="1"/>
+  </w:num>
+  <w:num w:numId="4" w16cid:durableId="107891456">
+    <w:abstractNumId w:val="5"/>
+  </w:num>
+  <w:num w:numId="5" w16cid:durableId="1137645582">
+    <w:abstractNumId w:val="4"/>
+  </w:num>
+  <w:num w:numId="6" w16cid:durableId="583344769">
+    <w:abstractNumId w:val="3"/>
   </w:num>
 </w:numbering>
 </file>
@@ -1754,6 +2404,17 @@
       <w:spacing w:val="5"/>
     </w:rPr>
   </w:style>
+  <w:style w:type="paragraph" w:styleId="NormalWeb">
+    <w:name w:val="Normal (Web)"/>
+    <w:basedOn w:val="a"/>
+    <w:uiPriority w:val="99"/>
+    <w:semiHidden/>
+    <w:unhideWhenUsed/>
+    <w:rsid w:val="00260800"/>
+    <w:rPr>
+      <w:rFonts w:ascii="Times New Roman" w:hAnsi="Times New Roman" w:cs="Times New Roman"/>
+    </w:rPr>
+  </w:style>
 </w:styles>
 </file>
 

</xml_diff>

<commit_message>
Summary and arrangement for submission
</commit_message>
<xml_diff>
--- a/סיכום מילולי על הפתרונות.docx
+++ b/סיכום מילולי על הפתרונות.docx
@@ -1,10 +1,221 @@
 
 <file path=word/document.xml><?xml version="1.0" encoding="utf-8"?>
-<w:document xmlns:wpc="http://schemas.microsoft.com/office/word/2010/wordprocessingCanvas" xmlns:cx="http://schemas.microsoft.com/office/drawing/2014/chartex" xmlns:cx1="http://schemas.microsoft.com/office/drawing/2015/9/8/chartex" xmlns:cx2="http://schemas.microsoft.com/office/drawing/2015/10/21/chartex" xmlns:cx3="http://schemas.microsoft.com/office/drawing/2016/5/9/chartex" xmlns:cx4="http://schemas.microsoft.com/office/drawing/2016/5/10/chartex" xmlns:cx5="http://schemas.microsoft.com/office/drawing/2016/5/11/chartex" xmlns:cx6="http://schemas.microsoft.com/office/drawing/2016/5/12/chartex" xmlns:cx7="http://schemas.microsoft.com/office/drawing/2016/5/13/chartex" xmlns:cx8="http://schemas.microsoft.com/office/drawing/2016/5/14/chartex" xmlns:mc="http://schemas.openxmlformats.org/markup-compatibility/2006" xmlns:aink="http://schemas.microsoft.com/office/drawing/2016/ink" xmlns:am3d="http://schemas.microsoft.com/office/drawing/2017/model3d" xmlns:o="urn:schemas-microsoft-com:office:office" xmlns:oel="http://schemas.microsoft.com/office/2019/extlst" xmlns:r="http://schemas.openxmlformats.org/officeDocument/2006/relationships" xmlns:m="http://schemas.openxmlformats.org/officeDocument/2006/math" xmlns:v="urn:schemas-microsoft-com:vml" xmlns:wp14="http://schemas.microsoft.com/office/word/2010/wordprocessingDrawing" xmlns:wp="http://schemas.openxmlformats.org/drawingml/2006/wordprocessingDrawing" xmlns:w10="urn:schemas-microsoft-com:office:word" xmlns:w="http://schemas.openxmlformats.org/wordprocessingml/2006/main" xmlns:w14="http://schemas.microsoft.com/office/word/2010/wordml" xmlns:w15="http://schemas.microsoft.com/office/word/2012/wordml" xmlns:w16cex="http://schemas.microsoft.com/office/word/2018/wordml/cex" xmlns:w16cid="http://schemas.microsoft.com/office/word/2016/wordml/cid" xmlns:w16="http://schemas.microsoft.com/office/word/2018/wordml" xmlns:w16du="http://schemas.microsoft.com/office/word/2023/wordml/word16du" xmlns:w16sdtdh="http://schemas.microsoft.com/office/word/2020/wordml/sdtdatahash" xmlns:w16se="http://schemas.microsoft.com/office/word/2015/wordml/symex" xmlns:wpg="http://schemas.microsoft.com/office/word/2010/wordprocessingGroup" xmlns:wpi="http://schemas.microsoft.com/office/word/2010/wordprocessingInk" xmlns:wne="http://schemas.microsoft.com/office/word/2006/wordml" xmlns:wps="http://schemas.microsoft.com/office/word/2010/wordprocessingShape" mc:Ignorable="w14 w15 w16se w16cid w16 w16cex w16sdtdh w16du wp14">
+<w:document xmlns:wpc="http://schemas.microsoft.com/office/word/2010/wordprocessingCanvas" xmlns:mc="http://schemas.openxmlformats.org/markup-compatibility/2006" xmlns:o="urn:schemas-microsoft-com:office:office" xmlns:r="http://schemas.openxmlformats.org/officeDocument/2006/relationships" xmlns:m="http://schemas.openxmlformats.org/officeDocument/2006/math" xmlns:v="urn:schemas-microsoft-com:vml" xmlns:wp14="http://schemas.microsoft.com/office/word/2010/wordprocessingDrawing" xmlns:wp="http://schemas.openxmlformats.org/drawingml/2006/wordprocessingDrawing" xmlns:w10="urn:schemas-microsoft-com:office:word" xmlns:w="http://schemas.openxmlformats.org/wordprocessingml/2006/main" xmlns:w14="http://schemas.microsoft.com/office/word/2010/wordml" xmlns:w15="http://schemas.microsoft.com/office/word/2012/wordml" xmlns:wpg="http://schemas.microsoft.com/office/word/2010/wordprocessingGroup" xmlns:wpi="http://schemas.microsoft.com/office/word/2010/wordprocessingInk" xmlns:wne="http://schemas.microsoft.com/office/word/2006/wordml" xmlns:wps="http://schemas.microsoft.com/office/word/2010/wordprocessingShape" mc:Ignorable="w14 w15 wp14">
   <w:body>
     <w:p>
       <w:pPr>
         <w:pStyle w:val="a9"/>
+        <w:rPr>
+          <w:b/>
+          <w:bCs/>
+          <w:rtl/>
+        </w:rPr>
+      </w:pPr>
+      <w:r>
+        <w:rPr>
+          <w:rFonts w:hint="cs"/>
+          <w:b/>
+          <w:bCs/>
+          <w:rtl/>
+        </w:rPr>
+        <w:t>שלום,</w:t>
+      </w:r>
+    </w:p>
+    <w:p>
+      <w:pPr>
+        <w:pStyle w:val="a9"/>
+        <w:rPr>
+          <w:b/>
+          <w:bCs/>
+          <w:rtl/>
+        </w:rPr>
+      </w:pPr>
+    </w:p>
+    <w:p>
+      <w:pPr>
+        <w:pStyle w:val="a9"/>
+        <w:rPr>
+          <w:b/>
+          <w:bCs/>
+          <w:sz w:val="26"/>
+          <w:szCs w:val="28"/>
+          <w:rtl/>
+        </w:rPr>
+      </w:pPr>
+      <w:r>
+        <w:rPr>
+          <w:rFonts w:hint="cs"/>
+          <w:b/>
+          <w:bCs/>
+          <w:sz w:val="26"/>
+          <w:szCs w:val="28"/>
+          <w:rtl/>
+        </w:rPr>
+        <w:t>השוואה בין יעילות שיטות פיתוח שונות למערכת חישוב תשלומים דינמית. הקוראת נוסחאות ותעריפים ישירות ממסד הנתונים.</w:t>
+      </w:r>
+    </w:p>
+    <w:p>
+      <w:pPr>
+        <w:pStyle w:val="a9"/>
+        <w:rPr>
+          <w:b/>
+          <w:bCs/>
+          <w:rtl/>
+        </w:rPr>
+      </w:pPr>
+    </w:p>
+    <w:p>
+      <w:pPr>
+        <w:pStyle w:val="a9"/>
+        <w:rPr>
+          <w:b/>
+          <w:bCs/>
+          <w:rtl/>
+        </w:rPr>
+      </w:pPr>
+      <w:r>
+        <w:rPr>
+          <w:rFonts w:hint="cs"/>
+          <w:b/>
+          <w:bCs/>
+          <w:rtl/>
+        </w:rPr>
+        <w:t xml:space="preserve">תומכת במגוון רחב של פעולות מתמטיות ואף תנאי </w:t>
+      </w:r>
+      <w:r>
+        <w:rPr>
+          <w:b/>
+          <w:bCs/>
+        </w:rPr>
+        <w:t>if</w:t>
+      </w:r>
+      <w:r>
+        <w:rPr>
+          <w:rFonts w:hint="cs"/>
+          <w:b/>
+          <w:bCs/>
+          <w:rtl/>
+        </w:rPr>
+        <w:t>.</w:t>
+      </w:r>
+    </w:p>
+    <w:p>
+      <w:pPr>
+        <w:pStyle w:val="a9"/>
+        <w:rPr>
+          <w:b/>
+          <w:bCs/>
+          <w:rtl/>
+        </w:rPr>
+      </w:pPr>
+    </w:p>
+    <w:p>
+      <w:pPr>
+        <w:pStyle w:val="a9"/>
+        <w:rPr>
+          <w:b/>
+          <w:bCs/>
+          <w:rtl/>
+        </w:rPr>
+      </w:pPr>
+      <w:r>
+        <w:rPr>
+          <w:rFonts w:hint="cs"/>
+          <w:b/>
+          <w:bCs/>
+          <w:rtl/>
+        </w:rPr>
+        <w:t xml:space="preserve">בנוסף בשביל תוצאות </w:t>
+      </w:r>
+      <w:bookmarkStart w:id="0" w:name="_GoBack"/>
+      <w:bookmarkEnd w:id="0"/>
+      <w:r>
+        <w:rPr>
+          <w:rFonts w:hint="cs"/>
+          <w:b/>
+          <w:bCs/>
+          <w:rtl/>
+        </w:rPr>
+        <w:t xml:space="preserve">ההשוואה פיתחתי </w:t>
+      </w:r>
+      <w:proofErr w:type="spellStart"/>
+      <w:r>
+        <w:rPr>
+          <w:rFonts w:hint="cs"/>
+          <w:b/>
+          <w:bCs/>
+          <w:rtl/>
+        </w:rPr>
+        <w:t>דשבורד</w:t>
+      </w:r>
+      <w:proofErr w:type="spellEnd"/>
+      <w:r>
+        <w:rPr>
+          <w:rFonts w:hint="cs"/>
+          <w:b/>
+          <w:bCs/>
+          <w:rtl/>
+        </w:rPr>
+        <w:t xml:space="preserve"> מסכם.</w:t>
+      </w:r>
+    </w:p>
+    <w:p>
+      <w:pPr>
+        <w:pStyle w:val="a9"/>
+        <w:rPr>
+          <w:b/>
+          <w:bCs/>
+          <w:rtl/>
+        </w:rPr>
+      </w:pPr>
+    </w:p>
+    <w:p>
+      <w:pPr>
+        <w:pStyle w:val="a9"/>
+        <w:rPr>
+          <w:b/>
+          <w:bCs/>
+          <w:rtl/>
+        </w:rPr>
+      </w:pPr>
+    </w:p>
+    <w:p>
+      <w:pPr>
+        <w:pStyle w:val="a9"/>
+        <w:rPr>
+          <w:rFonts w:hint="cs"/>
+          <w:b/>
+          <w:bCs/>
+          <w:rtl/>
+        </w:rPr>
+      </w:pPr>
+      <w:r>
+        <w:rPr>
+          <w:rFonts w:hint="cs"/>
+          <w:b/>
+          <w:bCs/>
+          <w:rtl/>
+        </w:rPr>
+        <w:t>פירוט על דרכי הפתרון:</w:t>
+      </w:r>
+    </w:p>
+    <w:p>
+      <w:pPr>
+        <w:pStyle w:val="a9"/>
+        <w:rPr>
+          <w:b/>
+          <w:bCs/>
+          <w:rtl/>
+        </w:rPr>
+      </w:pPr>
+    </w:p>
+    <w:p>
+      <w:pPr>
+        <w:pStyle w:val="a9"/>
+        <w:rPr>
+          <w:rFonts w:hint="cs"/>
+          <w:rtl/>
+        </w:rPr>
       </w:pPr>
       <w:r>
         <w:rPr>
@@ -40,26 +251,42 @@
       </w:r>
       <w:r>
         <w:rPr>
-          <w:b/>
-          <w:bCs/>
-        </w:rPr>
-        <w:t xml:space="preserve"> </w:t>
+          <w:rFonts w:hint="cs"/>
+          <w:b/>
+          <w:bCs/>
+          <w:rtl/>
+        </w:rPr>
+        <w:t xml:space="preserve"> ספרית </w:t>
+      </w:r>
+      <w:r>
+        <w:rPr>
+          <w:b/>
+          <w:bCs/>
+        </w:rPr>
+        <w:t xml:space="preserve"> NCalc</w:t>
+      </w:r>
+      <w:r>
+        <w:rPr>
+          <w:rFonts w:hint="cs"/>
+          <w:rtl/>
+        </w:rPr>
+        <w:t xml:space="preserve"> של </w:t>
       </w:r>
       <w:proofErr w:type="spellStart"/>
       <w:r>
         <w:rPr>
-          <w:b/>
-          <w:bCs/>
-        </w:rPr>
-        <w:t>NCalc</w:t>
+          <w:rFonts w:hint="cs"/>
+          <w:rtl/>
+        </w:rPr>
+        <w:t>דוטנט</w:t>
       </w:r>
       <w:proofErr w:type="spellEnd"/>
       <w:r>
         <w:rPr>
-          <w:b/>
-          <w:bCs/>
-        </w:rPr>
-        <w:t xml:space="preserve"> </w:t>
+          <w:rFonts w:hint="cs"/>
+          <w:rtl/>
+        </w:rPr>
+        <w:t>.</w:t>
       </w:r>
     </w:p>
     <w:p>
@@ -76,13 +303,8 @@
         </w:rPr>
         <w:t xml:space="preserve">טעינת הנתונים והנוסחאות בוצעה ממסד הנתונים באמצעות </w:t>
       </w:r>
-      <w:proofErr w:type="spellStart"/>
-      <w:r>
-        <w:t>SqlDataAdapter</w:t>
-      </w:r>
-      <w:proofErr w:type="spellEnd"/>
-      <w:r>
-        <w:t xml:space="preserve"> </w:t>
+      <w:r>
+        <w:t xml:space="preserve">SqlDataAdapter </w:t>
       </w:r>
       <w:r>
         <w:rPr>
@@ -90,13 +312,8 @@
         </w:rPr>
         <w:t xml:space="preserve">לתוך </w:t>
       </w:r>
-      <w:proofErr w:type="spellStart"/>
-      <w:r>
-        <w:t>DataTable</w:t>
-      </w:r>
-      <w:proofErr w:type="spellEnd"/>
-      <w:r>
-        <w:t xml:space="preserve"> </w:t>
+      <w:r>
+        <w:t xml:space="preserve">DataTable </w:t>
       </w:r>
       <w:r>
         <w:rPr>
@@ -120,13 +337,8 @@
         </w:rPr>
         <w:t xml:space="preserve">ביצעתי פירוש של הנוסחה למחרוזת חישובית והפעלתי עליה חישוב דינמי באמצעות ספריית </w:t>
       </w:r>
-      <w:proofErr w:type="spellStart"/>
-      <w:r>
-        <w:t>NCalc</w:t>
-      </w:r>
-      <w:proofErr w:type="spellEnd"/>
-      <w:r>
-        <w:t xml:space="preserve">, </w:t>
+      <w:r>
+        <w:t xml:space="preserve">NCalc, </w:t>
       </w:r>
       <w:r>
         <w:rPr>
@@ -174,13 +386,8 @@
       <w:r>
         <w:t xml:space="preserve"> </w:t>
       </w:r>
-      <w:proofErr w:type="spellStart"/>
-      <w:r>
-        <w:t>SqlBulkCopy</w:t>
-      </w:r>
-      <w:proofErr w:type="spellEnd"/>
-      <w:r>
-        <w:t xml:space="preserve">, </w:t>
+      <w:r>
+        <w:t xml:space="preserve">SqlBulkCopy, </w:t>
       </w:r>
       <w:r>
         <w:rPr>
@@ -286,32 +493,25 @@
         </w:rPr>
         <w:t>ו־</w:t>
       </w:r>
-      <w:proofErr w:type="spellStart"/>
-      <w:r>
-        <w:t>SQLAlchemy</w:t>
-      </w:r>
-      <w:proofErr w:type="spellEnd"/>
-      <w:r>
+      <w:r>
+        <w:t xml:space="preserve">SQLAlchemy </w:t>
+      </w:r>
+      <w:r>
+        <w:rPr>
+          <w:rFonts w:hint="cs"/>
+          <w:rtl/>
+        </w:rPr>
         <w:t xml:space="preserve"> </w:t>
       </w:r>
       <w:r>
         <w:rPr>
-          <w:rFonts w:hint="cs"/>
-          <w:rtl/>
-        </w:rPr>
-        <w:t xml:space="preserve"> </w:t>
-      </w:r>
-      <w:r>
-        <w:rPr>
           <w:rtl/>
         </w:rPr>
         <w:t xml:space="preserve">לתוך </w:t>
       </w:r>
-      <w:proofErr w:type="spellStart"/>
       <w:r>
         <w:t>DataFrame</w:t>
       </w:r>
-      <w:proofErr w:type="spellEnd"/>
     </w:p>
     <w:p>
       <w:pPr>
@@ -358,13 +558,8 @@
       <w:r>
         <w:t xml:space="preserve"> </w:t>
       </w:r>
-      <w:proofErr w:type="spellStart"/>
-      <w:r>
-        <w:t>DataFrame.eval</w:t>
-      </w:r>
-      <w:proofErr w:type="spellEnd"/>
-      <w:r>
-        <w:t xml:space="preserve"> </w:t>
+      <w:r>
+        <w:t xml:space="preserve">DataFrame.eval </w:t>
       </w:r>
       <w:r>
         <w:rPr>
@@ -372,13 +567,8 @@
         </w:rPr>
         <w:t>ו־</w:t>
       </w:r>
-      <w:proofErr w:type="spellStart"/>
-      <w:r>
-        <w:t>np.where</w:t>
-      </w:r>
-      <w:proofErr w:type="spellEnd"/>
-      <w:r>
-        <w:t xml:space="preserve"> </w:t>
+      <w:r>
+        <w:t xml:space="preserve">np.where </w:t>
       </w:r>
     </w:p>
     <w:p>
@@ -436,11 +626,11 @@
         <w:t xml:space="preserve">וטעינה באמצעות </w:t>
       </w:r>
       <w:r>
-        <w:t xml:space="preserve">BULK </w:t>
+        <w:t>BULK INSERT</w:t>
       </w:r>
       <w:proofErr w:type="gramStart"/>
       <w:r>
-        <w:t xml:space="preserve">INSERT, </w:t>
+        <w:t xml:space="preserve">, </w:t>
       </w:r>
       <w:r>
         <w:rPr>
@@ -551,46 +741,36 @@
         </w:rPr>
         <w:t xml:space="preserve">מעבר על הנוסחאות מטבלת </w:t>
       </w:r>
-      <w:proofErr w:type="spellStart"/>
-      <w:r>
-        <w:t>t_targil</w:t>
-      </w:r>
-      <w:proofErr w:type="spellEnd"/>
-      <w:r>
+      <w:r>
+        <w:t xml:space="preserve">t_targil </w:t>
+      </w:r>
+      <w:r>
+        <w:rPr>
+          <w:rFonts w:hint="cs"/>
+          <w:rtl/>
+        </w:rPr>
         <w:t xml:space="preserve"> </w:t>
       </w:r>
       <w:r>
         <w:rPr>
-          <w:rFonts w:hint="cs"/>
-          <w:rtl/>
-        </w:rPr>
+          <w:rtl/>
+        </w:rPr>
+        <w:t>באמצעות</w:t>
+      </w:r>
+      <w:r>
+        <w:t xml:space="preserve"> Cursor, </w:t>
+      </w:r>
+      <w:r>
+        <w:rPr>
+          <w:rtl/>
+        </w:rPr>
+        <w:t xml:space="preserve">ובניית שאילתות דינמיות בעזרת </w:t>
+      </w:r>
+      <w:r>
         <w:t xml:space="preserve"> </w:t>
       </w:r>
       <w:r>
-        <w:rPr>
-          <w:rtl/>
-        </w:rPr>
-        <w:t>באמצעות</w:t>
-      </w:r>
-      <w:r>
-        <w:t xml:space="preserve"> Cursor, </w:t>
-      </w:r>
-      <w:r>
-        <w:rPr>
-          <w:rtl/>
-        </w:rPr>
-        <w:t xml:space="preserve">ובניית שאילתות דינמיות בעזרת </w:t>
-      </w:r>
-      <w:r>
-        <w:t xml:space="preserve"> </w:t>
-      </w:r>
-      <w:proofErr w:type="spellStart"/>
-      <w:r>
-        <w:t>sp_executesql</w:t>
-      </w:r>
-      <w:proofErr w:type="spellEnd"/>
-      <w:r>
-        <w:t xml:space="preserve">, </w:t>
+        <w:t xml:space="preserve">sp_executesql, </w:t>
       </w:r>
       <w:r>
         <w:rPr>
@@ -616,34 +796,24 @@
         </w:rPr>
         <w:t xml:space="preserve">ביצוע החישוב ישירות על טבלת </w:t>
       </w:r>
-      <w:proofErr w:type="spellStart"/>
-      <w:r>
-        <w:t>t_data</w:t>
-      </w:r>
-      <w:proofErr w:type="spellEnd"/>
-      <w:r>
+      <w:r>
+        <w:t xml:space="preserve">t_data </w:t>
+      </w:r>
+      <w:r>
+        <w:rPr>
+          <w:rFonts w:hint="cs"/>
+          <w:rtl/>
+        </w:rPr>
         <w:t xml:space="preserve"> </w:t>
       </w:r>
       <w:r>
         <w:rPr>
-          <w:rFonts w:hint="cs"/>
-          <w:rtl/>
-        </w:rPr>
-        <w:t xml:space="preserve"> </w:t>
-      </w:r>
-      <w:r>
-        <w:rPr>
           <w:rtl/>
         </w:rPr>
         <w:t>והכנסת התוצאות ל־</w:t>
       </w:r>
-      <w:proofErr w:type="spellStart"/>
-      <w:r>
-        <w:t>t_results</w:t>
-      </w:r>
-      <w:proofErr w:type="spellEnd"/>
-      <w:r>
-        <w:t xml:space="preserve">, </w:t>
+      <w:r>
+        <w:t xml:space="preserve">t_results, </w:t>
       </w:r>
       <w:r>
         <w:rPr>
@@ -670,85 +840,88 @@
     <w:p>
       <w:pPr>
         <w:pStyle w:val="a9"/>
+      </w:pPr>
+      <w:r>
+        <w:rPr>
+          <w:rtl/>
+        </w:rPr>
+        <w:br/>
+      </w:r>
+      <w:r>
+        <w:rPr>
+          <w:rtl/>
+        </w:rPr>
+        <w:t>לפי התוצאות, פתרון ה־</w:t>
+      </w:r>
+      <w:r>
+        <w:t xml:space="preserve">C# </w:t>
+      </w:r>
+      <w:r>
         <w:rPr>
           <w:rFonts w:hint="cs"/>
-        </w:rPr>
-      </w:pPr>
-      <w:r>
-        <w:rPr>
-          <w:rtl/>
-        </w:rPr>
+          <w:rtl/>
+        </w:rPr>
+        <w:t xml:space="preserve"> </w:t>
+      </w:r>
+      <w:r>
+        <w:rPr>
+          <w:rtl/>
+        </w:rPr>
+        <w:t>עם</w:t>
+      </w:r>
+      <w:r>
+        <w:t xml:space="preserve"> NCalc </w:t>
+      </w:r>
+      <w:r>
+        <w:rPr>
+          <w:rtl/>
+        </w:rPr>
+        <w:t>היה היעיל ביותר הכולל, בזכות איזון טוב בין זמן חישוב לזמן כתיבה ל־</w:t>
+      </w:r>
+      <w:r>
+        <w:t>DB.</w:t>
+      </w:r>
+      <w:r>
         <w:br/>
       </w:r>
       <w:r>
         <w:rPr>
           <w:rtl/>
         </w:rPr>
-        <w:t>לפי התוצאות, פתרון ה־</w:t>
-      </w:r>
-      <w:r>
-        <w:t xml:space="preserve">C# </w:t>
-      </w:r>
-      <w:r>
-        <w:rPr>
-          <w:rtl/>
-        </w:rPr>
-        <w:t>עם</w:t>
-      </w:r>
-      <w:r>
+        <w:t>לעומת זאת</w:t>
+      </w:r>
+      <w:r>
+        <w:t xml:space="preserve">, Python </w:t>
+      </w:r>
+      <w:r>
+        <w:rPr>
+          <w:rtl/>
+        </w:rPr>
+        <w:t xml:space="preserve">אמנם הצטיין במהירות חישוב, אך נפגע מזמני כתיבה וטעינה, </w:t>
+      </w:r>
+      <w:proofErr w:type="spellStart"/>
+      <w:r>
+        <w:rPr>
+          <w:rtl/>
+        </w:rPr>
+        <w:t>וה</w:t>
+      </w:r>
+      <w:proofErr w:type="spellEnd"/>
+      <w:r>
+        <w:rPr>
+          <w:rtl/>
+        </w:rPr>
+        <w:t>־</w:t>
+      </w:r>
+      <w:r>
+        <w:t xml:space="preserve">Stored Procedure </w:t>
+      </w:r>
+      <w:r>
+        <w:rPr>
+          <w:rFonts w:hint="cs"/>
+          <w:rtl/>
+        </w:rPr>
         <w:t xml:space="preserve"> </w:t>
-      </w:r>
-      <w:proofErr w:type="spellStart"/>
-      <w:r>
-        <w:t>NCalc</w:t>
-      </w:r>
-      <w:proofErr w:type="spellEnd"/>
-      <w:r>
-        <w:t xml:space="preserve"> </w:t>
-      </w:r>
-      <w:r>
-        <w:rPr>
-          <w:rtl/>
-        </w:rPr>
-        <w:t>היה היעיל ביותר הכולל, בזכות איזון טוב בין זמן חישוב לזמן כתיבה ל־</w:t>
-      </w:r>
-      <w:r>
-        <w:t>DB.</w:t>
-      </w:r>
-      <w:r>
-        <w:br/>
-      </w:r>
-      <w:r>
-        <w:rPr>
-          <w:rtl/>
-        </w:rPr>
-        <w:t>לעומת זאת</w:t>
-      </w:r>
-      <w:r>
-        <w:t xml:space="preserve">, Python </w:t>
-      </w:r>
-      <w:r>
-        <w:rPr>
-          <w:rtl/>
-        </w:rPr>
-        <w:t xml:space="preserve">אמנם הצטיין במהירות חישוב, אך נפגע מזמני כתיבה וטעינה, </w:t>
-      </w:r>
-      <w:proofErr w:type="spellStart"/>
-      <w:r>
-        <w:rPr>
-          <w:rtl/>
-        </w:rPr>
-        <w:t>וה</w:t>
-      </w:r>
-      <w:proofErr w:type="spellEnd"/>
-      <w:r>
-        <w:rPr>
-          <w:rtl/>
-        </w:rPr>
-        <w:t>־</w:t>
-      </w:r>
-      <w:r>
-        <w:t xml:space="preserve">Stored Procedure </w:t>
       </w:r>
       <w:r>
         <w:rPr>
@@ -773,7 +946,7 @@
 </file>
 
 <file path=word/numbering.xml><?xml version="1.0" encoding="utf-8"?>
-<w:numbering xmlns:wpc="http://schemas.microsoft.com/office/word/2010/wordprocessingCanvas" xmlns:cx="http://schemas.microsoft.com/office/drawing/2014/chartex" xmlns:cx1="http://schemas.microsoft.com/office/drawing/2015/9/8/chartex" xmlns:cx2="http://schemas.microsoft.com/office/drawing/2015/10/21/chartex" xmlns:cx3="http://schemas.microsoft.com/office/drawing/2016/5/9/chartex" xmlns:cx4="http://schemas.microsoft.com/office/drawing/2016/5/10/chartex" xmlns:cx5="http://schemas.microsoft.com/office/drawing/2016/5/11/chartex" xmlns:cx6="http://schemas.microsoft.com/office/drawing/2016/5/12/chartex" xmlns:cx7="http://schemas.microsoft.com/office/drawing/2016/5/13/chartex" xmlns:cx8="http://schemas.microsoft.com/office/drawing/2016/5/14/chartex" xmlns:mc="http://schemas.openxmlformats.org/markup-compatibility/2006" xmlns:aink="http://schemas.microsoft.com/office/drawing/2016/ink" xmlns:am3d="http://schemas.microsoft.com/office/drawing/2017/model3d" xmlns:o="urn:schemas-microsoft-com:office:office" xmlns:oel="http://schemas.microsoft.com/office/2019/extlst" xmlns:r="http://schemas.openxmlformats.org/officeDocument/2006/relationships" xmlns:m="http://schemas.openxmlformats.org/officeDocument/2006/math" xmlns:v="urn:schemas-microsoft-com:vml" xmlns:wp14="http://schemas.microsoft.com/office/word/2010/wordprocessingDrawing" xmlns:wp="http://schemas.openxmlformats.org/drawingml/2006/wordprocessingDrawing" xmlns:w10="urn:schemas-microsoft-com:office:word" xmlns:w="http://schemas.openxmlformats.org/wordprocessingml/2006/main" xmlns:w14="http://schemas.microsoft.com/office/word/2010/wordml" xmlns:w15="http://schemas.microsoft.com/office/word/2012/wordml" xmlns:w16cex="http://schemas.microsoft.com/office/word/2018/wordml/cex" xmlns:w16cid="http://schemas.microsoft.com/office/word/2016/wordml/cid" xmlns:w16="http://schemas.microsoft.com/office/word/2018/wordml" xmlns:w16du="http://schemas.microsoft.com/office/word/2023/wordml/word16du" xmlns:w16sdtdh="http://schemas.microsoft.com/office/word/2020/wordml/sdtdatahash" xmlns:w16se="http://schemas.microsoft.com/office/word/2015/wordml/symex" xmlns:wpg="http://schemas.microsoft.com/office/word/2010/wordprocessingGroup" xmlns:wpi="http://schemas.microsoft.com/office/word/2010/wordprocessingInk" xmlns:wne="http://schemas.microsoft.com/office/word/2006/wordml" xmlns:wps="http://schemas.microsoft.com/office/word/2010/wordprocessingShape" mc:Ignorable="w14 w15 w16se w16cid w16 w16cex w16sdtdh w16du wp14">
+<w:numbering xmlns:wpc="http://schemas.microsoft.com/office/word/2010/wordprocessingCanvas" xmlns:mc="http://schemas.openxmlformats.org/markup-compatibility/2006" xmlns:o="urn:schemas-microsoft-com:office:office" xmlns:r="http://schemas.openxmlformats.org/officeDocument/2006/relationships" xmlns:m="http://schemas.openxmlformats.org/officeDocument/2006/math" xmlns:v="urn:schemas-microsoft-com:vml" xmlns:wp14="http://schemas.microsoft.com/office/word/2010/wordprocessingDrawing" xmlns:wp="http://schemas.openxmlformats.org/drawingml/2006/wordprocessingDrawing" xmlns:w10="urn:schemas-microsoft-com:office:word" xmlns:w="http://schemas.openxmlformats.org/wordprocessingml/2006/main" xmlns:w14="http://schemas.microsoft.com/office/word/2010/wordml" xmlns:w15="http://schemas.microsoft.com/office/word/2012/wordml" xmlns:wpg="http://schemas.microsoft.com/office/word/2010/wordprocessingGroup" xmlns:wpi="http://schemas.microsoft.com/office/word/2010/wordprocessingInk" xmlns:wne="http://schemas.microsoft.com/office/word/2006/wordml" xmlns:wps="http://schemas.microsoft.com/office/word/2010/wordprocessingShape" mc:Ignorable="w14 w15 wp14">
   <w:abstractNum w:abstractNumId="0" w15:restartNumberingAfterBreak="0">
     <w:nsid w:val="065C28A6"/>
     <w:multiLevelType w:val="hybridMultilevel"/>
@@ -1464,29 +1637,29 @@
       </w:pPr>
     </w:lvl>
   </w:abstractNum>
-  <w:num w:numId="1" w16cid:durableId="2073963612">
+  <w:num w:numId="1">
     <w:abstractNumId w:val="0"/>
   </w:num>
-  <w:num w:numId="2" w16cid:durableId="438257645">
+  <w:num w:numId="2">
     <w:abstractNumId w:val="2"/>
   </w:num>
-  <w:num w:numId="3" w16cid:durableId="2111047458">
+  <w:num w:numId="3">
     <w:abstractNumId w:val="1"/>
   </w:num>
-  <w:num w:numId="4" w16cid:durableId="107891456">
+  <w:num w:numId="4">
     <w:abstractNumId w:val="5"/>
   </w:num>
-  <w:num w:numId="5" w16cid:durableId="1137645582">
+  <w:num w:numId="5">
     <w:abstractNumId w:val="4"/>
   </w:num>
-  <w:num w:numId="6" w16cid:durableId="583344769">
+  <w:num w:numId="6">
     <w:abstractNumId w:val="3"/>
   </w:num>
 </w:numbering>
 </file>
 
 <file path=word/styles.xml><?xml version="1.0" encoding="utf-8"?>
-<w:styles xmlns:mc="http://schemas.openxmlformats.org/markup-compatibility/2006" xmlns:r="http://schemas.openxmlformats.org/officeDocument/2006/relationships" xmlns:w="http://schemas.openxmlformats.org/wordprocessingml/2006/main" xmlns:w14="http://schemas.microsoft.com/office/word/2010/wordml" xmlns:w15="http://schemas.microsoft.com/office/word/2012/wordml" xmlns:w16cex="http://schemas.microsoft.com/office/word/2018/wordml/cex" xmlns:w16cid="http://schemas.microsoft.com/office/word/2016/wordml/cid" xmlns:w16="http://schemas.microsoft.com/office/word/2018/wordml" xmlns:w16du="http://schemas.microsoft.com/office/word/2023/wordml/word16du" xmlns:w16sdtdh="http://schemas.microsoft.com/office/word/2020/wordml/sdtdatahash" xmlns:w16se="http://schemas.microsoft.com/office/word/2015/wordml/symex" mc:Ignorable="w14 w15 w16se w16cid w16 w16cex w16sdtdh w16du">
+<w:styles xmlns:mc="http://schemas.openxmlformats.org/markup-compatibility/2006" xmlns:r="http://schemas.openxmlformats.org/officeDocument/2006/relationships" xmlns:w="http://schemas.openxmlformats.org/wordprocessingml/2006/main" xmlns:w14="http://schemas.microsoft.com/office/word/2010/wordml" xmlns:w15="http://schemas.microsoft.com/office/word/2012/wordml" mc:Ignorable="w14 w15">
   <w:docDefaults>
     <w:rPrDefault>
       <w:rPr>
@@ -1504,7 +1677,7 @@
       </w:pPr>
     </w:pPrDefault>
   </w:docDefaults>
-  <w:latentStyles w:defLockedState="0" w:defUIPriority="99" w:defSemiHidden="0" w:defUnhideWhenUsed="0" w:defQFormat="0" w:count="376">
+  <w:latentStyles w:defLockedState="0" w:defUIPriority="99" w:defSemiHidden="0" w:defUnhideWhenUsed="0" w:defQFormat="0" w:count="371">
     <w:lsdException w:name="Normal" w:uiPriority="0" w:qFormat="1"/>
     <w:lsdException w:name="heading 1" w:uiPriority="9" w:qFormat="1"/>
     <w:lsdException w:name="heading 2" w:semiHidden="1" w:uiPriority="9" w:unhideWhenUsed="1" w:qFormat="1"/>
@@ -1876,11 +2049,6 @@
     <w:lsdException w:name="List Table 5 Dark Accent 6" w:uiPriority="50"/>
     <w:lsdException w:name="List Table 6 Colorful Accent 6" w:uiPriority="51"/>
     <w:lsdException w:name="List Table 7 Colorful Accent 6" w:uiPriority="52"/>
-    <w:lsdException w:name="Mention" w:semiHidden="1" w:unhideWhenUsed="1"/>
-    <w:lsdException w:name="Smart Hyperlink" w:semiHidden="1" w:unhideWhenUsed="1"/>
-    <w:lsdException w:name="Hashtag" w:semiHidden="1" w:unhideWhenUsed="1"/>
-    <w:lsdException w:name="Unresolved Mention" w:semiHidden="1" w:unhideWhenUsed="1"/>
-    <w:lsdException w:name="Smart Link" w:semiHidden="1" w:unhideWhenUsed="1"/>
   </w:latentStyles>
   <w:style w:type="paragraph" w:default="1" w:styleId="a">
     <w:name w:val="Normal"/>
@@ -2091,6 +2259,7 @@
   <w:style w:type="character" w:default="1" w:styleId="a0">
     <w:name w:val="Default Paragraph Font"/>
     <w:uiPriority w:val="1"/>
+    <w:semiHidden/>
     <w:unhideWhenUsed/>
   </w:style>
   <w:style w:type="table" w:default="1" w:styleId="a1">

</xml_diff>